<commit_message>
fix: keep the tire retreading flowchart on a single A4 page
Lock row heights and turn off Word's document grid so the diagram no longer spills onto a second page.

Co-authored-by: iremalisan <iremalisan@users.noreply.github.com>
</commit_message>
<xml_diff>
--- a/dokuman/Soğuk Lastik Kaplama İş Akım Şeması.docx
+++ b/dokuman/Soğuk Lastik Kaplama İş Akım Şeması.docx
@@ -4,9 +4,10 @@
   <w:body>
     <w:p>
       <w:pPr>
-        <w:spacing w:before="0" w:after="200" w:lineRule="exact" w:line="440"/>
+        <w:spacing w:before="0" w:after="120" w:lineRule="exact" w:line="400"/>
         <w:jc w:val="center"/>
         <w:contextualSpacing w:val="0"/>
+        <w:snapToGrid w:val="0"/>
       </w:pPr>
       <w:r>
         <w:rPr>
@@ -41,7 +42,7 @@
       </w:tblGrid>
       <w:tr>
         <w:trPr>
-          <w:trHeight w:val="740" w:hRule="atLeast"/>
+          <w:trHeight w:val="840" w:hRule="exact"/>
           <w:cantSplit/>
         </w:trPr>
         <w:tc>
@@ -67,6 +68,7 @@
               <w:spacing w:before="0" w:after="0" w:lineRule="exact" w:line="320"/>
               <w:jc w:val="center"/>
               <w:contextualSpacing w:val="0"/>
+              <w:snapToGrid w:val="0"/>
             </w:pPr>
             <w:r>
               <w:rPr>
@@ -84,7 +86,7 @@
       </w:tr>
       <w:tr>
         <w:trPr>
-          <w:trHeight w:val="320" w:hRule="exact"/>
+          <w:trHeight w:val="280" w:hRule="exact"/>
           <w:cantSplit/>
         </w:trPr>
         <w:tc>
@@ -110,6 +112,7 @@
               <w:spacing w:before="0" w:after="0" w:lineRule="exact" w:line="240"/>
               <w:jc w:val="center"/>
               <w:contextualSpacing w:val="0"/>
+              <w:snapToGrid w:val="0"/>
             </w:pPr>
             <w:r>
               <w:rPr>
@@ -127,7 +130,7 @@
       </w:tr>
       <w:tr>
         <w:trPr>
-          <w:trHeight w:val="740" w:hRule="atLeast"/>
+          <w:trHeight w:val="840" w:hRule="exact"/>
           <w:cantSplit/>
         </w:trPr>
         <w:tc>
@@ -153,6 +156,7 @@
               <w:spacing w:before="0" w:after="0" w:lineRule="exact" w:line="320"/>
               <w:jc w:val="center"/>
               <w:contextualSpacing w:val="0"/>
+              <w:snapToGrid w:val="0"/>
             </w:pPr>
             <w:r>
               <w:rPr>
@@ -170,7 +174,7 @@
       </w:tr>
       <w:tr>
         <w:trPr>
-          <w:trHeight w:val="320" w:hRule="exact"/>
+          <w:trHeight w:val="280" w:hRule="exact"/>
           <w:cantSplit/>
         </w:trPr>
         <w:tc>
@@ -196,6 +200,7 @@
               <w:spacing w:before="0" w:after="0" w:lineRule="exact" w:line="240"/>
               <w:jc w:val="center"/>
               <w:contextualSpacing w:val="0"/>
+              <w:snapToGrid w:val="0"/>
             </w:pPr>
             <w:r>
               <w:rPr>
@@ -213,7 +218,7 @@
       </w:tr>
       <w:tr>
         <w:trPr>
-          <w:trHeight w:val="740" w:hRule="atLeast"/>
+          <w:trHeight w:val="840" w:hRule="exact"/>
           <w:cantSplit/>
         </w:trPr>
         <w:tc>
@@ -239,6 +244,7 @@
               <w:spacing w:before="0" w:after="0" w:lineRule="exact" w:line="320"/>
               <w:jc w:val="center"/>
               <w:contextualSpacing w:val="0"/>
+              <w:snapToGrid w:val="0"/>
             </w:pPr>
             <w:r>
               <w:rPr>
@@ -256,7 +262,7 @@
       </w:tr>
       <w:tr>
         <w:trPr>
-          <w:trHeight w:val="320" w:hRule="exact"/>
+          <w:trHeight w:val="280" w:hRule="exact"/>
           <w:cantSplit/>
         </w:trPr>
         <w:tc>
@@ -282,6 +288,7 @@
               <w:spacing w:before="0" w:after="0" w:lineRule="exact" w:line="240"/>
               <w:jc w:val="center"/>
               <w:contextualSpacing w:val="0"/>
+              <w:snapToGrid w:val="0"/>
             </w:pPr>
             <w:r>
               <w:rPr>
@@ -299,7 +306,7 @@
       </w:tr>
       <w:tr>
         <w:trPr>
-          <w:trHeight w:val="740" w:hRule="atLeast"/>
+          <w:trHeight w:val="840" w:hRule="exact"/>
           <w:cantSplit/>
         </w:trPr>
         <w:tc>
@@ -325,6 +332,7 @@
               <w:spacing w:before="0" w:after="0" w:lineRule="exact" w:line="320"/>
               <w:jc w:val="center"/>
               <w:contextualSpacing w:val="0"/>
+              <w:snapToGrid w:val="0"/>
             </w:pPr>
             <w:r>
               <w:rPr>
@@ -342,7 +350,7 @@
       </w:tr>
       <w:tr>
         <w:trPr>
-          <w:trHeight w:val="320" w:hRule="exact"/>
+          <w:trHeight w:val="280" w:hRule="exact"/>
           <w:cantSplit/>
         </w:trPr>
         <w:tc>
@@ -368,6 +376,7 @@
               <w:spacing w:before="0" w:after="0" w:lineRule="exact" w:line="240"/>
               <w:jc w:val="center"/>
               <w:contextualSpacing w:val="0"/>
+              <w:snapToGrid w:val="0"/>
             </w:pPr>
             <w:r>
               <w:rPr>
@@ -385,7 +394,7 @@
       </w:tr>
       <w:tr>
         <w:trPr>
-          <w:trHeight w:val="740" w:hRule="atLeast"/>
+          <w:trHeight w:val="840" w:hRule="exact"/>
           <w:cantSplit/>
         </w:trPr>
         <w:tc>
@@ -411,6 +420,7 @@
               <w:spacing w:before="0" w:after="0" w:lineRule="exact" w:line="320"/>
               <w:jc w:val="center"/>
               <w:contextualSpacing w:val="0"/>
+              <w:snapToGrid w:val="0"/>
             </w:pPr>
             <w:r>
               <w:rPr>
@@ -428,7 +438,7 @@
       </w:tr>
       <w:tr>
         <w:trPr>
-          <w:trHeight w:val="320" w:hRule="exact"/>
+          <w:trHeight w:val="280" w:hRule="exact"/>
           <w:cantSplit/>
         </w:trPr>
         <w:tc>
@@ -454,6 +464,7 @@
               <w:spacing w:before="0" w:after="0" w:lineRule="exact" w:line="240"/>
               <w:jc w:val="center"/>
               <w:contextualSpacing w:val="0"/>
+              <w:snapToGrid w:val="0"/>
             </w:pPr>
             <w:r>
               <w:rPr>
@@ -471,7 +482,7 @@
       </w:tr>
       <w:tr>
         <w:trPr>
-          <w:trHeight w:val="740" w:hRule="atLeast"/>
+          <w:trHeight w:val="840" w:hRule="exact"/>
           <w:cantSplit/>
         </w:trPr>
         <w:tc>
@@ -497,6 +508,7 @@
               <w:spacing w:before="0" w:after="0" w:lineRule="exact" w:line="320"/>
               <w:jc w:val="center"/>
               <w:contextualSpacing w:val="0"/>
+              <w:snapToGrid w:val="0"/>
             </w:pPr>
             <w:r>
               <w:rPr>
@@ -514,7 +526,7 @@
       </w:tr>
       <w:tr>
         <w:trPr>
-          <w:trHeight w:val="320" w:hRule="exact"/>
+          <w:trHeight w:val="280" w:hRule="exact"/>
           <w:cantSplit/>
         </w:trPr>
         <w:tc>
@@ -540,6 +552,7 @@
               <w:spacing w:before="0" w:after="0" w:lineRule="exact" w:line="240"/>
               <w:jc w:val="center"/>
               <w:contextualSpacing w:val="0"/>
+              <w:snapToGrid w:val="0"/>
             </w:pPr>
             <w:r>
               <w:rPr>
@@ -557,7 +570,7 @@
       </w:tr>
       <w:tr>
         <w:trPr>
-          <w:trHeight w:val="740" w:hRule="atLeast"/>
+          <w:trHeight w:val="840" w:hRule="exact"/>
           <w:cantSplit/>
         </w:trPr>
         <w:tc>
@@ -583,6 +596,7 @@
               <w:spacing w:before="0" w:after="0" w:lineRule="exact" w:line="320"/>
               <w:jc w:val="center"/>
               <w:contextualSpacing w:val="0"/>
+              <w:snapToGrid w:val="0"/>
             </w:pPr>
             <w:r>
               <w:rPr>
@@ -600,7 +614,7 @@
       </w:tr>
       <w:tr>
         <w:trPr>
-          <w:trHeight w:val="320" w:hRule="exact"/>
+          <w:trHeight w:val="280" w:hRule="exact"/>
           <w:cantSplit/>
         </w:trPr>
         <w:tc>
@@ -626,6 +640,7 @@
               <w:spacing w:before="0" w:after="0" w:lineRule="exact" w:line="240"/>
               <w:jc w:val="center"/>
               <w:contextualSpacing w:val="0"/>
+              <w:snapToGrid w:val="0"/>
             </w:pPr>
             <w:r>
               <w:rPr>
@@ -643,7 +658,7 @@
       </w:tr>
       <w:tr>
         <w:trPr>
-          <w:trHeight w:val="740" w:hRule="atLeast"/>
+          <w:trHeight w:val="840" w:hRule="exact"/>
           <w:cantSplit/>
         </w:trPr>
         <w:tc>
@@ -669,6 +684,7 @@
               <w:spacing w:before="0" w:after="0" w:lineRule="exact" w:line="320"/>
               <w:jc w:val="center"/>
               <w:contextualSpacing w:val="0"/>
+              <w:snapToGrid w:val="0"/>
             </w:pPr>
             <w:r>
               <w:rPr>
@@ -686,7 +702,7 @@
       </w:tr>
       <w:tr>
         <w:trPr>
-          <w:trHeight w:val="320" w:hRule="exact"/>
+          <w:trHeight w:val="280" w:hRule="exact"/>
           <w:cantSplit/>
         </w:trPr>
         <w:tc>
@@ -712,6 +728,7 @@
               <w:spacing w:before="0" w:after="0" w:lineRule="exact" w:line="240"/>
               <w:jc w:val="center"/>
               <w:contextualSpacing w:val="0"/>
+              <w:snapToGrid w:val="0"/>
             </w:pPr>
             <w:r>
               <w:rPr>
@@ -729,7 +746,7 @@
       </w:tr>
       <w:tr>
         <w:trPr>
-          <w:trHeight w:val="740" w:hRule="atLeast"/>
+          <w:trHeight w:val="840" w:hRule="exact"/>
           <w:cantSplit/>
         </w:trPr>
         <w:tc>
@@ -755,6 +772,7 @@
               <w:spacing w:before="0" w:after="0" w:lineRule="exact" w:line="320"/>
               <w:jc w:val="center"/>
               <w:contextualSpacing w:val="0"/>
+              <w:snapToGrid w:val="0"/>
             </w:pPr>
             <w:r>
               <w:rPr>
@@ -772,7 +790,7 @@
       </w:tr>
       <w:tr>
         <w:trPr>
-          <w:trHeight w:val="320" w:hRule="exact"/>
+          <w:trHeight w:val="280" w:hRule="exact"/>
           <w:cantSplit/>
         </w:trPr>
         <w:tc>
@@ -798,6 +816,7 @@
               <w:spacing w:before="0" w:after="0" w:lineRule="exact" w:line="240"/>
               <w:jc w:val="center"/>
               <w:contextualSpacing w:val="0"/>
+              <w:snapToGrid w:val="0"/>
             </w:pPr>
             <w:r>
               <w:rPr>
@@ -815,7 +834,7 @@
       </w:tr>
       <w:tr>
         <w:trPr>
-          <w:trHeight w:val="740" w:hRule="atLeast"/>
+          <w:trHeight w:val="840" w:hRule="exact"/>
           <w:cantSplit/>
         </w:trPr>
         <w:tc>
@@ -841,6 +860,7 @@
               <w:spacing w:before="0" w:after="0" w:lineRule="exact" w:line="320"/>
               <w:jc w:val="center"/>
               <w:contextualSpacing w:val="0"/>
+              <w:snapToGrid w:val="0"/>
             </w:pPr>
             <w:r>
               <w:rPr>
@@ -858,7 +878,7 @@
       </w:tr>
       <w:tr>
         <w:trPr>
-          <w:trHeight w:val="320" w:hRule="exact"/>
+          <w:trHeight w:val="280" w:hRule="exact"/>
           <w:cantSplit/>
         </w:trPr>
         <w:tc>
@@ -884,6 +904,7 @@
               <w:spacing w:before="0" w:after="0" w:lineRule="exact" w:line="240"/>
               <w:jc w:val="center"/>
               <w:contextualSpacing w:val="0"/>
+              <w:snapToGrid w:val="0"/>
             </w:pPr>
             <w:r>
               <w:rPr>
@@ -901,7 +922,7 @@
       </w:tr>
       <w:tr>
         <w:trPr>
-          <w:trHeight w:val="740" w:hRule="atLeast"/>
+          <w:trHeight w:val="840" w:hRule="exact"/>
           <w:cantSplit/>
         </w:trPr>
         <w:tc>
@@ -927,6 +948,7 @@
               <w:spacing w:before="0" w:after="0" w:lineRule="exact" w:line="320"/>
               <w:jc w:val="center"/>
               <w:contextualSpacing w:val="0"/>
+              <w:snapToGrid w:val="0"/>
             </w:pPr>
             <w:r>
               <w:rPr>
@@ -944,7 +966,7 @@
       </w:tr>
       <w:tr>
         <w:trPr>
-          <w:trHeight w:val="320" w:hRule="exact"/>
+          <w:trHeight w:val="280" w:hRule="exact"/>
           <w:cantSplit/>
         </w:trPr>
         <w:tc>
@@ -970,6 +992,7 @@
               <w:spacing w:before="0" w:after="0" w:lineRule="exact" w:line="240"/>
               <w:jc w:val="center"/>
               <w:contextualSpacing w:val="0"/>
+              <w:snapToGrid w:val="0"/>
             </w:pPr>
             <w:r>
               <w:rPr>
@@ -987,7 +1010,7 @@
       </w:tr>
       <w:tr>
         <w:trPr>
-          <w:trHeight w:val="740" w:hRule="atLeast"/>
+          <w:trHeight w:val="840" w:hRule="exact"/>
           <w:cantSplit/>
         </w:trPr>
         <w:tc>
@@ -1013,6 +1036,7 @@
               <w:spacing w:before="0" w:after="0" w:lineRule="exact" w:line="320"/>
               <w:jc w:val="center"/>
               <w:contextualSpacing w:val="0"/>
+              <w:snapToGrid w:val="0"/>
             </w:pPr>
             <w:r>
               <w:rPr>
@@ -1030,7 +1054,7 @@
       </w:tr>
       <w:tr>
         <w:trPr>
-          <w:trHeight w:val="320" w:hRule="exact"/>
+          <w:trHeight w:val="280" w:hRule="exact"/>
           <w:cantSplit/>
         </w:trPr>
         <w:tc>
@@ -1056,6 +1080,7 @@
               <w:spacing w:before="0" w:after="0" w:lineRule="exact" w:line="240"/>
               <w:jc w:val="center"/>
               <w:contextualSpacing w:val="0"/>
+              <w:snapToGrid w:val="0"/>
             </w:pPr>
             <w:r>
               <w:rPr>
@@ -1073,7 +1098,7 @@
       </w:tr>
       <w:tr>
         <w:trPr>
-          <w:trHeight w:val="740" w:hRule="atLeast"/>
+          <w:trHeight w:val="840" w:hRule="exact"/>
           <w:cantSplit/>
         </w:trPr>
         <w:tc>
@@ -1099,6 +1124,7 @@
               <w:spacing w:before="0" w:after="0" w:lineRule="exact" w:line="320"/>
               <w:jc w:val="center"/>
               <w:contextualSpacing w:val="0"/>
+              <w:snapToGrid w:val="0"/>
             </w:pPr>
             <w:r>
               <w:rPr>
@@ -1117,9 +1143,8 @@
     </w:tbl>
     <w:sectPr>
       <w:pgSz w:w="11906" w:h="16838"/>
-      <w:pgMar w:top="850" w:right="1134" w:bottom="794" w:left="1134" w:header="283" w:footer="283" w:gutter="0"/>
+      <w:pgMar w:top="652" w:right="1020" w:bottom="567" w:left="1020" w:header="227" w:footer="227" w:gutter="0"/>
       <w:cols w:space="720"/>
-      <w:docGrid w:linePitch="360"/>
     </w:sectPr>
   </w:body>
 </w:document>
@@ -1490,6 +1515,7 @@
     <w:rsid w:val="00FC693F"/>
     <w:pPr>
       <w:spacing w:before="0" w:after="0"/>
+      <w:snapToGrid w:val="0"/>
     </w:pPr>
     <w:rPr>
       <w:rFonts w:ascii="Calibri" w:hAnsi="Calibri" w:cs="Calibri" w:eastAsia="Calibri"/>

</xml_diff>

<commit_message>
fix: shrink the flowchart so it stays on one page
Reduce box and arrow sizes so the full cold-tire process fits on a single A4 page in Word.

Co-authored-by: iremalisan <iremalisan@users.noreply.github.com>
</commit_message>
<xml_diff>
--- a/dokuman/Soğuk Lastik Kaplama İş Akım Şeması.docx
+++ b/dokuman/Soğuk Lastik Kaplama İş Akım Şeması.docx
@@ -4,7 +4,7 @@
   <w:body>
     <w:p>
       <w:pPr>
-        <w:spacing w:before="0" w:after="120" w:lineRule="exact" w:line="400"/>
+        <w:spacing w:before="0" w:after="40" w:lineRule="exact" w:line="320"/>
         <w:jc w:val="center"/>
         <w:contextualSpacing w:val="0"/>
         <w:snapToGrid w:val="0"/>
@@ -15,7 +15,7 @@
           <w:b/>
           <w:i w:val="0"/>
           <w:color w:val="000000"/>
-          <w:sz w:val="32"/>
+          <w:sz w:val="28"/>
           <w:lang w:val="tr-TR" w:eastAsia="tr-TR" w:bidi="tr-TR"/>
         </w:rPr>
         <w:t>Soğuk Lastik Kaplama İş Akım Şeması</w:t>
@@ -27,7 +27,6 @@
         <w:tblLayout w:type="fixed"/>
         <w:tblLook w:firstColumn="1" w:firstRow="1" w:lastColumn="0" w:lastRow="0" w:noHBand="0" w:noVBand="1" w:val="04A0"/>
         <w:jc w:val="center"/>
-        <w:tblCellSpacing w:w="0" w:type="dxa"/>
         <w:tblBorders>
           <w:top w:val="nil"/>
           <w:left w:val="nil"/>
@@ -42,7 +41,7 @@
       </w:tblGrid>
       <w:tr>
         <w:trPr>
-          <w:trHeight w:val="840" w:hRule="exact"/>
+          <w:trHeight w:val="560" w:hRule="exact"/>
           <w:cantSplit/>
         </w:trPr>
         <w:tc>
@@ -50,22 +49,22 @@
             <w:tcW w:type="dxa" w:w="8504"/>
             <w:shd w:val="clear" w:color="auto" w:fill="FFFFFF"/>
             <w:tcBorders>
-              <w:top w:val="single" w:sz="12" w:space="0" w:color="000000"/>
-              <w:left w:val="single" w:sz="12" w:space="0" w:color="000000"/>
-              <w:bottom w:val="single" w:sz="12" w:space="0" w:color="000000"/>
-              <w:right w:val="single" w:sz="12" w:space="0" w:color="000000"/>
+              <w:top w:val="single" w:sz="8" w:space="0" w:color="000000"/>
+              <w:left w:val="single" w:sz="8" w:space="0" w:color="000000"/>
+              <w:bottom w:val="single" w:sz="8" w:space="0" w:color="000000"/>
+              <w:right w:val="single" w:sz="8" w:space="0" w:color="000000"/>
             </w:tcBorders>
             <w:tcMar>
-              <w:top w:w="80" w:type="dxa"/>
-              <w:left w:w="160" w:type="dxa"/>
-              <w:bottom w:w="80" w:type="dxa"/>
-              <w:right w:w="160" w:type="dxa"/>
+              <w:top w:w="40" w:type="dxa"/>
+              <w:left w:w="120" w:type="dxa"/>
+              <w:bottom w:w="40" w:type="dxa"/>
+              <w:right w:w="120" w:type="dxa"/>
             </w:tcMar>
             <w:vAlign w:val="center"/>
           </w:tcPr>
           <w:p>
             <w:pPr>
-              <w:spacing w:before="0" w:after="0" w:lineRule="exact" w:line="320"/>
+              <w:spacing w:before="0" w:after="0" w:lineRule="exact" w:line="280"/>
               <w:jc w:val="center"/>
               <w:contextualSpacing w:val="0"/>
               <w:snapToGrid w:val="0"/>
@@ -76,7 +75,7 @@
                 <w:b w:val="0"/>
                 <w:i w:val="0"/>
                 <w:color w:val="000000"/>
-                <w:sz w:val="24"/>
+                <w:sz w:val="22"/>
                 <w:lang w:val="tr-TR" w:eastAsia="tr-TR" w:bidi="tr-TR"/>
               </w:rPr>
               <w:t>Kullanılmış Lastik (Karkas)</w:t>
@@ -86,7 +85,7 @@
       </w:tr>
       <w:tr>
         <w:trPr>
-          <w:trHeight w:val="280" w:hRule="exact"/>
+          <w:trHeight w:val="220" w:hRule="exact"/>
           <w:cantSplit/>
         </w:trPr>
         <w:tc>
@@ -109,7 +108,7 @@
           </w:tcPr>
           <w:p>
             <w:pPr>
-              <w:spacing w:before="0" w:after="0" w:lineRule="exact" w:line="240"/>
+              <w:spacing w:before="0" w:after="0" w:lineRule="exact" w:line="200"/>
               <w:jc w:val="center"/>
               <w:contextualSpacing w:val="0"/>
               <w:snapToGrid w:val="0"/>
@@ -120,7 +119,7 @@
                 <w:b w:val="0"/>
                 <w:i w:val="0"/>
                 <w:color w:val="000000"/>
-                <w:sz w:val="20"/>
+                <w:sz w:val="16"/>
                 <w:lang w:val="tr-TR" w:eastAsia="tr-TR" w:bidi="tr-TR"/>
               </w:rPr>
               <w:t>▼</w:t>
@@ -130,7 +129,7 @@
       </w:tr>
       <w:tr>
         <w:trPr>
-          <w:trHeight w:val="840" w:hRule="exact"/>
+          <w:trHeight w:val="560" w:hRule="exact"/>
           <w:cantSplit/>
         </w:trPr>
         <w:tc>
@@ -138,22 +137,22 @@
             <w:tcW w:type="dxa" w:w="8504"/>
             <w:shd w:val="clear" w:color="auto" w:fill="FFFFFF"/>
             <w:tcBorders>
-              <w:top w:val="single" w:sz="12" w:space="0" w:color="000000"/>
-              <w:left w:val="single" w:sz="12" w:space="0" w:color="000000"/>
-              <w:bottom w:val="single" w:sz="12" w:space="0" w:color="000000"/>
-              <w:right w:val="single" w:sz="12" w:space="0" w:color="000000"/>
+              <w:top w:val="single" w:sz="8" w:space="0" w:color="000000"/>
+              <w:left w:val="single" w:sz="8" w:space="0" w:color="000000"/>
+              <w:bottom w:val="single" w:sz="8" w:space="0" w:color="000000"/>
+              <w:right w:val="single" w:sz="8" w:space="0" w:color="000000"/>
             </w:tcBorders>
             <w:tcMar>
-              <w:top w:w="80" w:type="dxa"/>
-              <w:left w:w="160" w:type="dxa"/>
-              <w:bottom w:w="80" w:type="dxa"/>
-              <w:right w:w="160" w:type="dxa"/>
+              <w:top w:w="40" w:type="dxa"/>
+              <w:left w:w="120" w:type="dxa"/>
+              <w:bottom w:w="40" w:type="dxa"/>
+              <w:right w:w="120" w:type="dxa"/>
             </w:tcMar>
             <w:vAlign w:val="center"/>
           </w:tcPr>
           <w:p>
             <w:pPr>
-              <w:spacing w:before="0" w:after="0" w:lineRule="exact" w:line="320"/>
+              <w:spacing w:before="0" w:after="0" w:lineRule="exact" w:line="280"/>
               <w:jc w:val="center"/>
               <w:contextualSpacing w:val="0"/>
               <w:snapToGrid w:val="0"/>
@@ -164,7 +163,7 @@
                 <w:b w:val="0"/>
                 <w:i w:val="0"/>
                 <w:color w:val="000000"/>
-                <w:sz w:val="24"/>
+                <w:sz w:val="22"/>
                 <w:lang w:val="tr-TR" w:eastAsia="tr-TR" w:bidi="tr-TR"/>
               </w:rPr>
               <w:t>Ön Kontrol ve Seçim</w:t>
@@ -174,7 +173,7 @@
       </w:tr>
       <w:tr>
         <w:trPr>
-          <w:trHeight w:val="280" w:hRule="exact"/>
+          <w:trHeight w:val="220" w:hRule="exact"/>
           <w:cantSplit/>
         </w:trPr>
         <w:tc>
@@ -197,7 +196,7 @@
           </w:tcPr>
           <w:p>
             <w:pPr>
-              <w:spacing w:before="0" w:after="0" w:lineRule="exact" w:line="240"/>
+              <w:spacing w:before="0" w:after="0" w:lineRule="exact" w:line="200"/>
               <w:jc w:val="center"/>
               <w:contextualSpacing w:val="0"/>
               <w:snapToGrid w:val="0"/>
@@ -208,7 +207,7 @@
                 <w:b w:val="0"/>
                 <w:i w:val="0"/>
                 <w:color w:val="000000"/>
-                <w:sz w:val="20"/>
+                <w:sz w:val="16"/>
                 <w:lang w:val="tr-TR" w:eastAsia="tr-TR" w:bidi="tr-TR"/>
               </w:rPr>
               <w:t>▼</w:t>
@@ -218,7 +217,7 @@
       </w:tr>
       <w:tr>
         <w:trPr>
-          <w:trHeight w:val="840" w:hRule="exact"/>
+          <w:trHeight w:val="560" w:hRule="exact"/>
           <w:cantSplit/>
         </w:trPr>
         <w:tc>
@@ -226,22 +225,22 @@
             <w:tcW w:type="dxa" w:w="8504"/>
             <w:shd w:val="clear" w:color="auto" w:fill="FFFFFF"/>
             <w:tcBorders>
-              <w:top w:val="single" w:sz="12" w:space="0" w:color="000000"/>
-              <w:left w:val="single" w:sz="12" w:space="0" w:color="000000"/>
-              <w:bottom w:val="single" w:sz="12" w:space="0" w:color="000000"/>
-              <w:right w:val="single" w:sz="12" w:space="0" w:color="000000"/>
+              <w:top w:val="single" w:sz="8" w:space="0" w:color="000000"/>
+              <w:left w:val="single" w:sz="8" w:space="0" w:color="000000"/>
+              <w:bottom w:val="single" w:sz="8" w:space="0" w:color="000000"/>
+              <w:right w:val="single" w:sz="8" w:space="0" w:color="000000"/>
             </w:tcBorders>
             <w:tcMar>
-              <w:top w:w="80" w:type="dxa"/>
-              <w:left w:w="160" w:type="dxa"/>
-              <w:bottom w:w="80" w:type="dxa"/>
-              <w:right w:w="160" w:type="dxa"/>
+              <w:top w:w="40" w:type="dxa"/>
+              <w:left w:w="120" w:type="dxa"/>
+              <w:bottom w:w="40" w:type="dxa"/>
+              <w:right w:w="120" w:type="dxa"/>
             </w:tcMar>
             <w:vAlign w:val="center"/>
           </w:tcPr>
           <w:p>
             <w:pPr>
-              <w:spacing w:before="0" w:after="0" w:lineRule="exact" w:line="320"/>
+              <w:spacing w:before="0" w:after="0" w:lineRule="exact" w:line="280"/>
               <w:jc w:val="center"/>
               <w:contextualSpacing w:val="0"/>
               <w:snapToGrid w:val="0"/>
@@ -252,7 +251,7 @@
                 <w:b w:val="0"/>
                 <w:i w:val="0"/>
                 <w:color w:val="000000"/>
-                <w:sz w:val="24"/>
+                <w:sz w:val="22"/>
                 <w:lang w:val="tr-TR" w:eastAsia="tr-TR" w:bidi="tr-TR"/>
               </w:rPr>
               <w:t>İç Yapı Testleri</w:t>
@@ -262,7 +261,7 @@
       </w:tr>
       <w:tr>
         <w:trPr>
-          <w:trHeight w:val="280" w:hRule="exact"/>
+          <w:trHeight w:val="220" w:hRule="exact"/>
           <w:cantSplit/>
         </w:trPr>
         <w:tc>
@@ -285,7 +284,7 @@
           </w:tcPr>
           <w:p>
             <w:pPr>
-              <w:spacing w:before="0" w:after="0" w:lineRule="exact" w:line="240"/>
+              <w:spacing w:before="0" w:after="0" w:lineRule="exact" w:line="200"/>
               <w:jc w:val="center"/>
               <w:contextualSpacing w:val="0"/>
               <w:snapToGrid w:val="0"/>
@@ -296,7 +295,7 @@
                 <w:b w:val="0"/>
                 <w:i w:val="0"/>
                 <w:color w:val="000000"/>
-                <w:sz w:val="20"/>
+                <w:sz w:val="16"/>
                 <w:lang w:val="tr-TR" w:eastAsia="tr-TR" w:bidi="tr-TR"/>
               </w:rPr>
               <w:t>▼</w:t>
@@ -306,7 +305,7 @@
       </w:tr>
       <w:tr>
         <w:trPr>
-          <w:trHeight w:val="840" w:hRule="exact"/>
+          <w:trHeight w:val="560" w:hRule="exact"/>
           <w:cantSplit/>
         </w:trPr>
         <w:tc>
@@ -314,22 +313,22 @@
             <w:tcW w:type="dxa" w:w="8504"/>
             <w:shd w:val="clear" w:color="auto" w:fill="FFFFFF"/>
             <w:tcBorders>
-              <w:top w:val="single" w:sz="12" w:space="0" w:color="000000"/>
-              <w:left w:val="single" w:sz="12" w:space="0" w:color="000000"/>
-              <w:bottom w:val="single" w:sz="12" w:space="0" w:color="000000"/>
-              <w:right w:val="single" w:sz="12" w:space="0" w:color="000000"/>
+              <w:top w:val="single" w:sz="8" w:space="0" w:color="000000"/>
+              <w:left w:val="single" w:sz="8" w:space="0" w:color="000000"/>
+              <w:bottom w:val="single" w:sz="8" w:space="0" w:color="000000"/>
+              <w:right w:val="single" w:sz="8" w:space="0" w:color="000000"/>
             </w:tcBorders>
             <w:tcMar>
-              <w:top w:w="80" w:type="dxa"/>
-              <w:left w:w="160" w:type="dxa"/>
-              <w:bottom w:w="80" w:type="dxa"/>
-              <w:right w:w="160" w:type="dxa"/>
+              <w:top w:w="40" w:type="dxa"/>
+              <w:left w:w="120" w:type="dxa"/>
+              <w:bottom w:w="40" w:type="dxa"/>
+              <w:right w:w="120" w:type="dxa"/>
             </w:tcMar>
             <w:vAlign w:val="center"/>
           </w:tcPr>
           <w:p>
             <w:pPr>
-              <w:spacing w:before="0" w:after="0" w:lineRule="exact" w:line="320"/>
+              <w:spacing w:before="0" w:after="0" w:lineRule="exact" w:line="280"/>
               <w:jc w:val="center"/>
               <w:contextualSpacing w:val="0"/>
               <w:snapToGrid w:val="0"/>
@@ -340,7 +339,7 @@
                 <w:b w:val="0"/>
                 <w:i w:val="0"/>
                 <w:color w:val="000000"/>
-                <w:sz w:val="24"/>
+                <w:sz w:val="22"/>
                 <w:lang w:val="tr-TR" w:eastAsia="tr-TR" w:bidi="tr-TR"/>
               </w:rPr>
               <w:t>Eski Dişlerin Raspalanması</w:t>
@@ -350,7 +349,7 @@
       </w:tr>
       <w:tr>
         <w:trPr>
-          <w:trHeight w:val="280" w:hRule="exact"/>
+          <w:trHeight w:val="220" w:hRule="exact"/>
           <w:cantSplit/>
         </w:trPr>
         <w:tc>
@@ -373,7 +372,7 @@
           </w:tcPr>
           <w:p>
             <w:pPr>
-              <w:spacing w:before="0" w:after="0" w:lineRule="exact" w:line="240"/>
+              <w:spacing w:before="0" w:after="0" w:lineRule="exact" w:line="200"/>
               <w:jc w:val="center"/>
               <w:contextualSpacing w:val="0"/>
               <w:snapToGrid w:val="0"/>
@@ -384,7 +383,7 @@
                 <w:b w:val="0"/>
                 <w:i w:val="0"/>
                 <w:color w:val="000000"/>
-                <w:sz w:val="20"/>
+                <w:sz w:val="16"/>
                 <w:lang w:val="tr-TR" w:eastAsia="tr-TR" w:bidi="tr-TR"/>
               </w:rPr>
               <w:t>▼</w:t>
@@ -394,7 +393,7 @@
       </w:tr>
       <w:tr>
         <w:trPr>
-          <w:trHeight w:val="840" w:hRule="exact"/>
+          <w:trHeight w:val="560" w:hRule="exact"/>
           <w:cantSplit/>
         </w:trPr>
         <w:tc>
@@ -402,22 +401,22 @@
             <w:tcW w:type="dxa" w:w="8504"/>
             <w:shd w:val="clear" w:color="auto" w:fill="FFFFFF"/>
             <w:tcBorders>
-              <w:top w:val="single" w:sz="12" w:space="0" w:color="000000"/>
-              <w:left w:val="single" w:sz="12" w:space="0" w:color="000000"/>
-              <w:bottom w:val="single" w:sz="12" w:space="0" w:color="000000"/>
-              <w:right w:val="single" w:sz="12" w:space="0" w:color="000000"/>
+              <w:top w:val="single" w:sz="8" w:space="0" w:color="000000"/>
+              <w:left w:val="single" w:sz="8" w:space="0" w:color="000000"/>
+              <w:bottom w:val="single" w:sz="8" w:space="0" w:color="000000"/>
+              <w:right w:val="single" w:sz="8" w:space="0" w:color="000000"/>
             </w:tcBorders>
             <w:tcMar>
-              <w:top w:w="80" w:type="dxa"/>
-              <w:left w:w="160" w:type="dxa"/>
-              <w:bottom w:w="80" w:type="dxa"/>
-              <w:right w:w="160" w:type="dxa"/>
+              <w:top w:w="40" w:type="dxa"/>
+              <w:left w:w="120" w:type="dxa"/>
+              <w:bottom w:w="40" w:type="dxa"/>
+              <w:right w:w="120" w:type="dxa"/>
             </w:tcMar>
             <w:vAlign w:val="center"/>
           </w:tcPr>
           <w:p>
             <w:pPr>
-              <w:spacing w:before="0" w:after="0" w:lineRule="exact" w:line="320"/>
+              <w:spacing w:before="0" w:after="0" w:lineRule="exact" w:line="280"/>
               <w:jc w:val="center"/>
               <w:contextualSpacing w:val="0"/>
               <w:snapToGrid w:val="0"/>
@@ -428,7 +427,7 @@
                 <w:b w:val="0"/>
                 <w:i w:val="0"/>
                 <w:color w:val="000000"/>
-                <w:sz w:val="24"/>
+                <w:sz w:val="22"/>
                 <w:lang w:val="tr-TR" w:eastAsia="tr-TR" w:bidi="tr-TR"/>
               </w:rPr>
               <w:t>Hasar Onarımı</w:t>
@@ -438,7 +437,7 @@
       </w:tr>
       <w:tr>
         <w:trPr>
-          <w:trHeight w:val="280" w:hRule="exact"/>
+          <w:trHeight w:val="220" w:hRule="exact"/>
           <w:cantSplit/>
         </w:trPr>
         <w:tc>
@@ -461,7 +460,7 @@
           </w:tcPr>
           <w:p>
             <w:pPr>
-              <w:spacing w:before="0" w:after="0" w:lineRule="exact" w:line="240"/>
+              <w:spacing w:before="0" w:after="0" w:lineRule="exact" w:line="200"/>
               <w:jc w:val="center"/>
               <w:contextualSpacing w:val="0"/>
               <w:snapToGrid w:val="0"/>
@@ -472,7 +471,7 @@
                 <w:b w:val="0"/>
                 <w:i w:val="0"/>
                 <w:color w:val="000000"/>
-                <w:sz w:val="20"/>
+                <w:sz w:val="16"/>
                 <w:lang w:val="tr-TR" w:eastAsia="tr-TR" w:bidi="tr-TR"/>
               </w:rPr>
               <w:t>▼</w:t>
@@ -482,7 +481,7 @@
       </w:tr>
       <w:tr>
         <w:trPr>
-          <w:trHeight w:val="840" w:hRule="exact"/>
+          <w:trHeight w:val="560" w:hRule="exact"/>
           <w:cantSplit/>
         </w:trPr>
         <w:tc>
@@ -490,22 +489,22 @@
             <w:tcW w:type="dxa" w:w="8504"/>
             <w:shd w:val="clear" w:color="auto" w:fill="FFFFFF"/>
             <w:tcBorders>
-              <w:top w:val="single" w:sz="12" w:space="0" w:color="000000"/>
-              <w:left w:val="single" w:sz="12" w:space="0" w:color="000000"/>
-              <w:bottom w:val="single" w:sz="12" w:space="0" w:color="000000"/>
-              <w:right w:val="single" w:sz="12" w:space="0" w:color="000000"/>
+              <w:top w:val="single" w:sz="8" w:space="0" w:color="000000"/>
+              <w:left w:val="single" w:sz="8" w:space="0" w:color="000000"/>
+              <w:bottom w:val="single" w:sz="8" w:space="0" w:color="000000"/>
+              <w:right w:val="single" w:sz="8" w:space="0" w:color="000000"/>
             </w:tcBorders>
             <w:tcMar>
-              <w:top w:w="80" w:type="dxa"/>
-              <w:left w:w="160" w:type="dxa"/>
-              <w:bottom w:w="80" w:type="dxa"/>
-              <w:right w:w="160" w:type="dxa"/>
+              <w:top w:w="40" w:type="dxa"/>
+              <w:left w:w="120" w:type="dxa"/>
+              <w:bottom w:w="40" w:type="dxa"/>
+              <w:right w:w="120" w:type="dxa"/>
             </w:tcMar>
             <w:vAlign w:val="center"/>
           </w:tcPr>
           <w:p>
             <w:pPr>
-              <w:spacing w:before="0" w:after="0" w:lineRule="exact" w:line="320"/>
+              <w:spacing w:before="0" w:after="0" w:lineRule="exact" w:line="280"/>
               <w:jc w:val="center"/>
               <w:contextualSpacing w:val="0"/>
               <w:snapToGrid w:val="0"/>
@@ -516,7 +515,7 @@
                 <w:b w:val="0"/>
                 <w:i w:val="0"/>
                 <w:color w:val="000000"/>
-                <w:sz w:val="24"/>
+                <w:sz w:val="22"/>
                 <w:lang w:val="tr-TR" w:eastAsia="tr-TR" w:bidi="tr-TR"/>
               </w:rPr>
               <w:t>Yüzey Temizliği ve Hazırlık</w:t>
@@ -526,7 +525,7 @@
       </w:tr>
       <w:tr>
         <w:trPr>
-          <w:trHeight w:val="280" w:hRule="exact"/>
+          <w:trHeight w:val="220" w:hRule="exact"/>
           <w:cantSplit/>
         </w:trPr>
         <w:tc>
@@ -549,7 +548,7 @@
           </w:tcPr>
           <w:p>
             <w:pPr>
-              <w:spacing w:before="0" w:after="0" w:lineRule="exact" w:line="240"/>
+              <w:spacing w:before="0" w:after="0" w:lineRule="exact" w:line="200"/>
               <w:jc w:val="center"/>
               <w:contextualSpacing w:val="0"/>
               <w:snapToGrid w:val="0"/>
@@ -560,7 +559,7 @@
                 <w:b w:val="0"/>
                 <w:i w:val="0"/>
                 <w:color w:val="000000"/>
-                <w:sz w:val="20"/>
+                <w:sz w:val="16"/>
                 <w:lang w:val="tr-TR" w:eastAsia="tr-TR" w:bidi="tr-TR"/>
               </w:rPr>
               <w:t>▼</w:t>
@@ -570,7 +569,7 @@
       </w:tr>
       <w:tr>
         <w:trPr>
-          <w:trHeight w:val="840" w:hRule="exact"/>
+          <w:trHeight w:val="560" w:hRule="exact"/>
           <w:cantSplit/>
         </w:trPr>
         <w:tc>
@@ -578,22 +577,22 @@
             <w:tcW w:type="dxa" w:w="8504"/>
             <w:shd w:val="clear" w:color="auto" w:fill="FFFFFF"/>
             <w:tcBorders>
-              <w:top w:val="single" w:sz="12" w:space="0" w:color="000000"/>
-              <w:left w:val="single" w:sz="12" w:space="0" w:color="000000"/>
-              <w:bottom w:val="single" w:sz="12" w:space="0" w:color="000000"/>
-              <w:right w:val="single" w:sz="12" w:space="0" w:color="000000"/>
+              <w:top w:val="single" w:sz="8" w:space="0" w:color="000000"/>
+              <w:left w:val="single" w:sz="8" w:space="0" w:color="000000"/>
+              <w:bottom w:val="single" w:sz="8" w:space="0" w:color="000000"/>
+              <w:right w:val="single" w:sz="8" w:space="0" w:color="000000"/>
             </w:tcBorders>
             <w:tcMar>
-              <w:top w:w="80" w:type="dxa"/>
-              <w:left w:w="160" w:type="dxa"/>
-              <w:bottom w:w="80" w:type="dxa"/>
-              <w:right w:w="160" w:type="dxa"/>
+              <w:top w:w="40" w:type="dxa"/>
+              <w:left w:w="120" w:type="dxa"/>
+              <w:bottom w:w="40" w:type="dxa"/>
+              <w:right w:w="120" w:type="dxa"/>
             </w:tcMar>
             <w:vAlign w:val="center"/>
           </w:tcPr>
           <w:p>
             <w:pPr>
-              <w:spacing w:before="0" w:after="0" w:lineRule="exact" w:line="320"/>
+              <w:spacing w:before="0" w:after="0" w:lineRule="exact" w:line="280"/>
               <w:jc w:val="center"/>
               <w:contextualSpacing w:val="0"/>
               <w:snapToGrid w:val="0"/>
@@ -604,7 +603,7 @@
                 <w:b w:val="0"/>
                 <w:i w:val="0"/>
                 <w:color w:val="000000"/>
-                <w:sz w:val="24"/>
+                <w:sz w:val="22"/>
                 <w:lang w:val="tr-TR" w:eastAsia="tr-TR" w:bidi="tr-TR"/>
               </w:rPr>
               <w:t>Bağlayıcı Kauçuk Uygulaması</w:t>
@@ -614,7 +613,7 @@
       </w:tr>
       <w:tr>
         <w:trPr>
-          <w:trHeight w:val="280" w:hRule="exact"/>
+          <w:trHeight w:val="220" w:hRule="exact"/>
           <w:cantSplit/>
         </w:trPr>
         <w:tc>
@@ -637,7 +636,7 @@
           </w:tcPr>
           <w:p>
             <w:pPr>
-              <w:spacing w:before="0" w:after="0" w:lineRule="exact" w:line="240"/>
+              <w:spacing w:before="0" w:after="0" w:lineRule="exact" w:line="200"/>
               <w:jc w:val="center"/>
               <w:contextualSpacing w:val="0"/>
               <w:snapToGrid w:val="0"/>
@@ -648,7 +647,7 @@
                 <w:b w:val="0"/>
                 <w:i w:val="0"/>
                 <w:color w:val="000000"/>
-                <w:sz w:val="20"/>
+                <w:sz w:val="16"/>
                 <w:lang w:val="tr-TR" w:eastAsia="tr-TR" w:bidi="tr-TR"/>
               </w:rPr>
               <w:t>▼</w:t>
@@ -658,7 +657,7 @@
       </w:tr>
       <w:tr>
         <w:trPr>
-          <w:trHeight w:val="840" w:hRule="exact"/>
+          <w:trHeight w:val="560" w:hRule="exact"/>
           <w:cantSplit/>
         </w:trPr>
         <w:tc>
@@ -666,22 +665,22 @@
             <w:tcW w:type="dxa" w:w="8504"/>
             <w:shd w:val="clear" w:color="auto" w:fill="FFFFFF"/>
             <w:tcBorders>
-              <w:top w:val="single" w:sz="12" w:space="0" w:color="000000"/>
-              <w:left w:val="single" w:sz="12" w:space="0" w:color="000000"/>
-              <w:bottom w:val="single" w:sz="12" w:space="0" w:color="000000"/>
-              <w:right w:val="single" w:sz="12" w:space="0" w:color="000000"/>
+              <w:top w:val="single" w:sz="8" w:space="0" w:color="000000"/>
+              <w:left w:val="single" w:sz="8" w:space="0" w:color="000000"/>
+              <w:bottom w:val="single" w:sz="8" w:space="0" w:color="000000"/>
+              <w:right w:val="single" w:sz="8" w:space="0" w:color="000000"/>
             </w:tcBorders>
             <w:tcMar>
-              <w:top w:w="80" w:type="dxa"/>
-              <w:left w:w="160" w:type="dxa"/>
-              <w:bottom w:w="80" w:type="dxa"/>
-              <w:right w:w="160" w:type="dxa"/>
+              <w:top w:w="40" w:type="dxa"/>
+              <w:left w:w="120" w:type="dxa"/>
+              <w:bottom w:w="40" w:type="dxa"/>
+              <w:right w:w="120" w:type="dxa"/>
             </w:tcMar>
             <w:vAlign w:val="center"/>
           </w:tcPr>
           <w:p>
             <w:pPr>
-              <w:spacing w:before="0" w:after="0" w:lineRule="exact" w:line="320"/>
+              <w:spacing w:before="0" w:after="0" w:lineRule="exact" w:line="280"/>
               <w:jc w:val="center"/>
               <w:contextualSpacing w:val="0"/>
               <w:snapToGrid w:val="0"/>
@@ -692,7 +691,7 @@
                 <w:b w:val="0"/>
                 <w:i w:val="0"/>
                 <w:color w:val="000000"/>
-                <w:sz w:val="24"/>
+                <w:sz w:val="22"/>
                 <w:lang w:val="tr-TR" w:eastAsia="tr-TR" w:bidi="tr-TR"/>
               </w:rPr>
               <w:t>Hazır Sırt Lastiğinin Sarılması</w:t>
@@ -702,7 +701,7 @@
       </w:tr>
       <w:tr>
         <w:trPr>
-          <w:trHeight w:val="280" w:hRule="exact"/>
+          <w:trHeight w:val="220" w:hRule="exact"/>
           <w:cantSplit/>
         </w:trPr>
         <w:tc>
@@ -725,7 +724,7 @@
           </w:tcPr>
           <w:p>
             <w:pPr>
-              <w:spacing w:before="0" w:after="0" w:lineRule="exact" w:line="240"/>
+              <w:spacing w:before="0" w:after="0" w:lineRule="exact" w:line="200"/>
               <w:jc w:val="center"/>
               <w:contextualSpacing w:val="0"/>
               <w:snapToGrid w:val="0"/>
@@ -736,7 +735,7 @@
                 <w:b w:val="0"/>
                 <w:i w:val="0"/>
                 <w:color w:val="000000"/>
-                <w:sz w:val="20"/>
+                <w:sz w:val="16"/>
                 <w:lang w:val="tr-TR" w:eastAsia="tr-TR" w:bidi="tr-TR"/>
               </w:rPr>
               <w:t>▼</w:t>
@@ -746,7 +745,7 @@
       </w:tr>
       <w:tr>
         <w:trPr>
-          <w:trHeight w:val="840" w:hRule="exact"/>
+          <w:trHeight w:val="560" w:hRule="exact"/>
           <w:cantSplit/>
         </w:trPr>
         <w:tc>
@@ -754,22 +753,22 @@
             <w:tcW w:type="dxa" w:w="8504"/>
             <w:shd w:val="clear" w:color="auto" w:fill="FFFFFF"/>
             <w:tcBorders>
-              <w:top w:val="single" w:sz="12" w:space="0" w:color="000000"/>
-              <w:left w:val="single" w:sz="12" w:space="0" w:color="000000"/>
-              <w:bottom w:val="single" w:sz="12" w:space="0" w:color="000000"/>
-              <w:right w:val="single" w:sz="12" w:space="0" w:color="000000"/>
+              <w:top w:val="single" w:sz="8" w:space="0" w:color="000000"/>
+              <w:left w:val="single" w:sz="8" w:space="0" w:color="000000"/>
+              <w:bottom w:val="single" w:sz="8" w:space="0" w:color="000000"/>
+              <w:right w:val="single" w:sz="8" w:space="0" w:color="000000"/>
             </w:tcBorders>
             <w:tcMar>
-              <w:top w:w="80" w:type="dxa"/>
-              <w:left w:w="160" w:type="dxa"/>
-              <w:bottom w:w="80" w:type="dxa"/>
-              <w:right w:w="160" w:type="dxa"/>
+              <w:top w:w="40" w:type="dxa"/>
+              <w:left w:w="120" w:type="dxa"/>
+              <w:bottom w:w="40" w:type="dxa"/>
+              <w:right w:w="120" w:type="dxa"/>
             </w:tcMar>
             <w:vAlign w:val="center"/>
           </w:tcPr>
           <w:p>
             <w:pPr>
-              <w:spacing w:before="0" w:after="0" w:lineRule="exact" w:line="320"/>
+              <w:spacing w:before="0" w:after="0" w:lineRule="exact" w:line="280"/>
               <w:jc w:val="center"/>
               <w:contextualSpacing w:val="0"/>
               <w:snapToGrid w:val="0"/>
@@ -780,7 +779,7 @@
                 <w:b w:val="0"/>
                 <w:i w:val="0"/>
                 <w:color w:val="000000"/>
-                <w:sz w:val="24"/>
+                <w:sz w:val="22"/>
                 <w:lang w:val="tr-TR" w:eastAsia="tr-TR" w:bidi="tr-TR"/>
               </w:rPr>
               <w:t>Zarf Takılması</w:t>
@@ -790,7 +789,7 @@
       </w:tr>
       <w:tr>
         <w:trPr>
-          <w:trHeight w:val="280" w:hRule="exact"/>
+          <w:trHeight w:val="220" w:hRule="exact"/>
           <w:cantSplit/>
         </w:trPr>
         <w:tc>
@@ -813,7 +812,7 @@
           </w:tcPr>
           <w:p>
             <w:pPr>
-              <w:spacing w:before="0" w:after="0" w:lineRule="exact" w:line="240"/>
+              <w:spacing w:before="0" w:after="0" w:lineRule="exact" w:line="200"/>
               <w:jc w:val="center"/>
               <w:contextualSpacing w:val="0"/>
               <w:snapToGrid w:val="0"/>
@@ -824,7 +823,7 @@
                 <w:b w:val="0"/>
                 <w:i w:val="0"/>
                 <w:color w:val="000000"/>
-                <w:sz w:val="20"/>
+                <w:sz w:val="16"/>
                 <w:lang w:val="tr-TR" w:eastAsia="tr-TR" w:bidi="tr-TR"/>
               </w:rPr>
               <w:t>▼</w:t>
@@ -834,7 +833,7 @@
       </w:tr>
       <w:tr>
         <w:trPr>
-          <w:trHeight w:val="840" w:hRule="exact"/>
+          <w:trHeight w:val="560" w:hRule="exact"/>
           <w:cantSplit/>
         </w:trPr>
         <w:tc>
@@ -842,22 +841,22 @@
             <w:tcW w:type="dxa" w:w="8504"/>
             <w:shd w:val="clear" w:color="auto" w:fill="FFFFFF"/>
             <w:tcBorders>
-              <w:top w:val="single" w:sz="12" w:space="0" w:color="000000"/>
-              <w:left w:val="single" w:sz="12" w:space="0" w:color="000000"/>
-              <w:bottom w:val="single" w:sz="12" w:space="0" w:color="000000"/>
-              <w:right w:val="single" w:sz="12" w:space="0" w:color="000000"/>
+              <w:top w:val="single" w:sz="8" w:space="0" w:color="000000"/>
+              <w:left w:val="single" w:sz="8" w:space="0" w:color="000000"/>
+              <w:bottom w:val="single" w:sz="8" w:space="0" w:color="000000"/>
+              <w:right w:val="single" w:sz="8" w:space="0" w:color="000000"/>
             </w:tcBorders>
             <w:tcMar>
-              <w:top w:w="80" w:type="dxa"/>
-              <w:left w:w="160" w:type="dxa"/>
-              <w:bottom w:w="80" w:type="dxa"/>
-              <w:right w:w="160" w:type="dxa"/>
+              <w:top w:w="40" w:type="dxa"/>
+              <w:left w:w="120" w:type="dxa"/>
+              <w:bottom w:w="40" w:type="dxa"/>
+              <w:right w:w="120" w:type="dxa"/>
             </w:tcMar>
             <w:vAlign w:val="center"/>
           </w:tcPr>
           <w:p>
             <w:pPr>
-              <w:spacing w:before="0" w:after="0" w:lineRule="exact" w:line="320"/>
+              <w:spacing w:before="0" w:after="0" w:lineRule="exact" w:line="280"/>
               <w:jc w:val="center"/>
               <w:contextualSpacing w:val="0"/>
               <w:snapToGrid w:val="0"/>
@@ -868,7 +867,7 @@
                 <w:b w:val="0"/>
                 <w:i w:val="0"/>
                 <w:color w:val="000000"/>
-                <w:sz w:val="24"/>
+                <w:sz w:val="22"/>
                 <w:lang w:val="tr-TR" w:eastAsia="tr-TR" w:bidi="tr-TR"/>
               </w:rPr>
               <w:t>Otoklavda Vulkanizasyon</w:t>
@@ -878,7 +877,7 @@
       </w:tr>
       <w:tr>
         <w:trPr>
-          <w:trHeight w:val="280" w:hRule="exact"/>
+          <w:trHeight w:val="220" w:hRule="exact"/>
           <w:cantSplit/>
         </w:trPr>
         <w:tc>
@@ -901,7 +900,7 @@
           </w:tcPr>
           <w:p>
             <w:pPr>
-              <w:spacing w:before="0" w:after="0" w:lineRule="exact" w:line="240"/>
+              <w:spacing w:before="0" w:after="0" w:lineRule="exact" w:line="200"/>
               <w:jc w:val="center"/>
               <w:contextualSpacing w:val="0"/>
               <w:snapToGrid w:val="0"/>
@@ -912,7 +911,7 @@
                 <w:b w:val="0"/>
                 <w:i w:val="0"/>
                 <w:color w:val="000000"/>
-                <w:sz w:val="20"/>
+                <w:sz w:val="16"/>
                 <w:lang w:val="tr-TR" w:eastAsia="tr-TR" w:bidi="tr-TR"/>
               </w:rPr>
               <w:t>▼</w:t>
@@ -922,7 +921,7 @@
       </w:tr>
       <w:tr>
         <w:trPr>
-          <w:trHeight w:val="840" w:hRule="exact"/>
+          <w:trHeight w:val="560" w:hRule="exact"/>
           <w:cantSplit/>
         </w:trPr>
         <w:tc>
@@ -930,22 +929,22 @@
             <w:tcW w:type="dxa" w:w="8504"/>
             <w:shd w:val="clear" w:color="auto" w:fill="FFFFFF"/>
             <w:tcBorders>
-              <w:top w:val="single" w:sz="12" w:space="0" w:color="000000"/>
-              <w:left w:val="single" w:sz="12" w:space="0" w:color="000000"/>
-              <w:bottom w:val="single" w:sz="12" w:space="0" w:color="000000"/>
-              <w:right w:val="single" w:sz="12" w:space="0" w:color="000000"/>
+              <w:top w:val="single" w:sz="8" w:space="0" w:color="000000"/>
+              <w:left w:val="single" w:sz="8" w:space="0" w:color="000000"/>
+              <w:bottom w:val="single" w:sz="8" w:space="0" w:color="000000"/>
+              <w:right w:val="single" w:sz="8" w:space="0" w:color="000000"/>
             </w:tcBorders>
             <w:tcMar>
-              <w:top w:w="80" w:type="dxa"/>
-              <w:left w:w="160" w:type="dxa"/>
-              <w:bottom w:w="80" w:type="dxa"/>
-              <w:right w:w="160" w:type="dxa"/>
+              <w:top w:w="40" w:type="dxa"/>
+              <w:left w:w="120" w:type="dxa"/>
+              <w:bottom w:w="40" w:type="dxa"/>
+              <w:right w:w="120" w:type="dxa"/>
             </w:tcMar>
             <w:vAlign w:val="center"/>
           </w:tcPr>
           <w:p>
             <w:pPr>
-              <w:spacing w:before="0" w:after="0" w:lineRule="exact" w:line="320"/>
+              <w:spacing w:before="0" w:after="0" w:lineRule="exact" w:line="280"/>
               <w:jc w:val="center"/>
               <w:contextualSpacing w:val="0"/>
               <w:snapToGrid w:val="0"/>
@@ -956,7 +955,7 @@
                 <w:b w:val="0"/>
                 <w:i w:val="0"/>
                 <w:color w:val="000000"/>
-                <w:sz w:val="24"/>
+                <w:sz w:val="22"/>
                 <w:lang w:val="tr-TR" w:eastAsia="tr-TR" w:bidi="tr-TR"/>
               </w:rPr>
               <w:t>Soğutma ve Zarfın Çıkarılması</w:t>
@@ -966,7 +965,7 @@
       </w:tr>
       <w:tr>
         <w:trPr>
-          <w:trHeight w:val="280" w:hRule="exact"/>
+          <w:trHeight w:val="220" w:hRule="exact"/>
           <w:cantSplit/>
         </w:trPr>
         <w:tc>
@@ -989,7 +988,7 @@
           </w:tcPr>
           <w:p>
             <w:pPr>
-              <w:spacing w:before="0" w:after="0" w:lineRule="exact" w:line="240"/>
+              <w:spacing w:before="0" w:after="0" w:lineRule="exact" w:line="200"/>
               <w:jc w:val="center"/>
               <w:contextualSpacing w:val="0"/>
               <w:snapToGrid w:val="0"/>
@@ -1000,7 +999,7 @@
                 <w:b w:val="0"/>
                 <w:i w:val="0"/>
                 <w:color w:val="000000"/>
-                <w:sz w:val="20"/>
+                <w:sz w:val="16"/>
                 <w:lang w:val="tr-TR" w:eastAsia="tr-TR" w:bidi="tr-TR"/>
               </w:rPr>
               <w:t>▼</w:t>
@@ -1010,7 +1009,7 @@
       </w:tr>
       <w:tr>
         <w:trPr>
-          <w:trHeight w:val="840" w:hRule="exact"/>
+          <w:trHeight w:val="560" w:hRule="exact"/>
           <w:cantSplit/>
         </w:trPr>
         <w:tc>
@@ -1018,22 +1017,22 @@
             <w:tcW w:type="dxa" w:w="8504"/>
             <w:shd w:val="clear" w:color="auto" w:fill="FFFFFF"/>
             <w:tcBorders>
-              <w:top w:val="single" w:sz="12" w:space="0" w:color="000000"/>
-              <w:left w:val="single" w:sz="12" w:space="0" w:color="000000"/>
-              <w:bottom w:val="single" w:sz="12" w:space="0" w:color="000000"/>
-              <w:right w:val="single" w:sz="12" w:space="0" w:color="000000"/>
+              <w:top w:val="single" w:sz="8" w:space="0" w:color="000000"/>
+              <w:left w:val="single" w:sz="8" w:space="0" w:color="000000"/>
+              <w:bottom w:val="single" w:sz="8" w:space="0" w:color="000000"/>
+              <w:right w:val="single" w:sz="8" w:space="0" w:color="000000"/>
             </w:tcBorders>
             <w:tcMar>
-              <w:top w:w="80" w:type="dxa"/>
-              <w:left w:w="160" w:type="dxa"/>
-              <w:bottom w:w="80" w:type="dxa"/>
-              <w:right w:w="160" w:type="dxa"/>
+              <w:top w:w="40" w:type="dxa"/>
+              <w:left w:w="120" w:type="dxa"/>
+              <w:bottom w:w="40" w:type="dxa"/>
+              <w:right w:w="120" w:type="dxa"/>
             </w:tcMar>
             <w:vAlign w:val="center"/>
           </w:tcPr>
           <w:p>
             <w:pPr>
-              <w:spacing w:before="0" w:after="0" w:lineRule="exact" w:line="320"/>
+              <w:spacing w:before="0" w:after="0" w:lineRule="exact" w:line="280"/>
               <w:jc w:val="center"/>
               <w:contextualSpacing w:val="0"/>
               <w:snapToGrid w:val="0"/>
@@ -1044,7 +1043,7 @@
                 <w:b w:val="0"/>
                 <w:i w:val="0"/>
                 <w:color w:val="000000"/>
-                <w:sz w:val="24"/>
+                <w:sz w:val="22"/>
                 <w:lang w:val="tr-TR" w:eastAsia="tr-TR" w:bidi="tr-TR"/>
               </w:rPr>
               <w:t>Son Kontrol</w:t>
@@ -1054,7 +1053,7 @@
       </w:tr>
       <w:tr>
         <w:trPr>
-          <w:trHeight w:val="280" w:hRule="exact"/>
+          <w:trHeight w:val="220" w:hRule="exact"/>
           <w:cantSplit/>
         </w:trPr>
         <w:tc>
@@ -1077,7 +1076,7 @@
           </w:tcPr>
           <w:p>
             <w:pPr>
-              <w:spacing w:before="0" w:after="0" w:lineRule="exact" w:line="240"/>
+              <w:spacing w:before="0" w:after="0" w:lineRule="exact" w:line="200"/>
               <w:jc w:val="center"/>
               <w:contextualSpacing w:val="0"/>
               <w:snapToGrid w:val="0"/>
@@ -1088,7 +1087,7 @@
                 <w:b w:val="0"/>
                 <w:i w:val="0"/>
                 <w:color w:val="000000"/>
-                <w:sz w:val="20"/>
+                <w:sz w:val="16"/>
                 <w:lang w:val="tr-TR" w:eastAsia="tr-TR" w:bidi="tr-TR"/>
               </w:rPr>
               <w:t>▼</w:t>
@@ -1098,7 +1097,7 @@
       </w:tr>
       <w:tr>
         <w:trPr>
-          <w:trHeight w:val="840" w:hRule="exact"/>
+          <w:trHeight w:val="560" w:hRule="exact"/>
           <w:cantSplit/>
         </w:trPr>
         <w:tc>
@@ -1106,22 +1105,22 @@
             <w:tcW w:type="dxa" w:w="8504"/>
             <w:shd w:val="clear" w:color="auto" w:fill="FFFFFF"/>
             <w:tcBorders>
-              <w:top w:val="single" w:sz="12" w:space="0" w:color="000000"/>
-              <w:left w:val="single" w:sz="12" w:space="0" w:color="000000"/>
-              <w:bottom w:val="single" w:sz="12" w:space="0" w:color="000000"/>
-              <w:right w:val="single" w:sz="12" w:space="0" w:color="000000"/>
+              <w:top w:val="single" w:sz="8" w:space="0" w:color="000000"/>
+              <w:left w:val="single" w:sz="8" w:space="0" w:color="000000"/>
+              <w:bottom w:val="single" w:sz="8" w:space="0" w:color="000000"/>
+              <w:right w:val="single" w:sz="8" w:space="0" w:color="000000"/>
             </w:tcBorders>
             <w:tcMar>
-              <w:top w:w="80" w:type="dxa"/>
-              <w:left w:w="160" w:type="dxa"/>
-              <w:bottom w:w="80" w:type="dxa"/>
-              <w:right w:w="160" w:type="dxa"/>
+              <w:top w:w="40" w:type="dxa"/>
+              <w:left w:w="120" w:type="dxa"/>
+              <w:bottom w:w="40" w:type="dxa"/>
+              <w:right w:w="120" w:type="dxa"/>
             </w:tcMar>
             <w:vAlign w:val="center"/>
           </w:tcPr>
           <w:p>
             <w:pPr>
-              <w:spacing w:before="0" w:after="0" w:lineRule="exact" w:line="320"/>
+              <w:spacing w:before="0" w:after="0" w:lineRule="exact" w:line="280"/>
               <w:jc w:val="center"/>
               <w:contextualSpacing w:val="0"/>
               <w:snapToGrid w:val="0"/>
@@ -1132,7 +1131,7 @@
                 <w:b w:val="0"/>
                 <w:i w:val="0"/>
                 <w:color w:val="000000"/>
-                <w:sz w:val="24"/>
+                <w:sz w:val="22"/>
                 <w:lang w:val="tr-TR" w:eastAsia="tr-TR" w:bidi="tr-TR"/>
               </w:rPr>
               <w:t>Kullanıma / Sevkiyata Hazır</w:t>
@@ -1142,8 +1141,8 @@
       </w:tr>
     </w:tbl>
     <w:sectPr>
-      <w:pgSz w:w="11906" w:h="16838"/>
-      <w:pgMar w:top="652" w:right="1020" w:bottom="567" w:left="1020" w:header="227" w:footer="227" w:gutter="0"/>
+      <w:pgSz w:w="11906" w:h="16838" w:code="9"/>
+      <w:pgMar w:top="624" w:right="1020" w:bottom="567" w:left="1020" w:header="227" w:footer="227" w:gutter="0"/>
       <w:cols w:space="720"/>
     </w:sectPr>
   </w:body>
@@ -1520,7 +1519,7 @@
     <w:rPr>
       <w:rFonts w:ascii="Calibri" w:hAnsi="Calibri" w:cs="Calibri" w:eastAsia="Calibri"/>
       <w:color w:val="000000"/>
-      <w:sz w:val="24"/>
+      <w:sz w:val="22"/>
     </w:rPr>
   </w:style>
   <w:style w:type="paragraph" w:styleId="Header">

</xml_diff>